<commit_message>
Mise à jour fiches et TO GPME
</commit_message>
<xml_diff>
--- a/bts-gpme/tp-1083/ressources/R01_1083_reperes_entreprise.docx
+++ b/bts-gpme/tp-1083/ressources/R01_1083_reperes_entreprise.docx
@@ -125,7 +125,15 @@
         <w:spacing w:after="40"/>
       </w:pPr>
       <w:r>
-        <w:t>Le site 1083 est publié par la SAS L’ÉQUIPE 1083, 49 avenue Gambetta, 26100 Romans-sur-Isère. SIRET : 498 845 064 00019 ; RCS Romans.</w:t>
+        <w:t>La SAS L’ÉQUIPE 1083 a été créée le 16 juillet 2007 et est implantée à Romans-sur-Isère, 49 avenue Gambetta. SIRET : 498 845 064 00019 ; RCS Romans.</w:t>
+      </w:r>
+    </w:p>
+    <w:p>
+      <w:pPr>
+        <w:pStyle w:val="ListBullet"/>
+      </w:pPr>
+      <w:r>
+        <w:t>Son activité principale actuellement enregistrée relève de la fabrication de vêtements de dessus (NAF/APE 14.13Z), notamment des jeans.</w:t>
       </w:r>
     </w:p>
     <w:p>
@@ -134,7 +142,7 @@
         <w:spacing w:after="40"/>
       </w:pPr>
       <w:r>
-        <w:t>La marque 1083 a été lancée en 2013. Elle commercialise notamment des jeans et d’autres vêtements fabriqués en France.</w:t>
+        <w:t>La marque 1083, distincte de la date de création de la société, a été lancée en 2013. Elle commercialise notamment des jeans, d’autres vêtements et des chaussures fabriqués en France.</w:t>
       </w:r>
     </w:p>
     <w:p>
@@ -156,11 +164,22 @@
       </w:r>
     </w:p>
     <w:p>
+      <w:r>
+        <w:rPr>
+          <w:b/>
+        </w:rPr>
+        <w:t xml:space="preserve">À ne pas confondre : </w:t>
+      </w:r>
+      <w:r>
+        <w:t>la société L’ÉQUIPE 1083 a été créée en 2007 ; 2013 correspond au lancement de la marque 1083.</w:t>
+      </w:r>
+    </w:p>
+    <w:p>
       <w:pPr>
         <w:pStyle w:val="Heading1"/>
       </w:pPr>
       <w:r>
-        <w:t>2. Canaux de vente et relation au marché</w:t>
+        <w:t>2. Commercialisation : B2C et B2B</w:t>
       </w:r>
     </w:p>
     <w:p>
@@ -169,7 +188,7 @@
         <w:spacing w:after="40"/>
       </w:pPr>
       <w:r>
-        <w:t>Vente en ligne sur le site 1083.fr.</w:t>
+        <w:t>Vente directe aux particuliers (B2C) : site e-commerce 1083.fr, boutiques officielles de Paris, Lyon (Croix-Rousse), Nantes et Grenoble, ainsi que le magasin d’usine de Romans-sur-Isère.</w:t>
       </w:r>
     </w:p>
     <w:p>
@@ -178,7 +197,7 @@
         <w:spacing w:after="40"/>
       </w:pPr>
       <w:r>
-        <w:t>Cinq boutiques officielles : Romans-sur-Isère, Lyon (Croix-Rousse), Grenoble, Nantes et Paris.</w:t>
+        <w:t>Vente via des professionnels (B2B) : réseau d’environ 130 boutiques revendeuses en France.</w:t>
       </w:r>
     </w:p>
     <w:p>
@@ -187,16 +206,7 @@
         <w:spacing w:after="40"/>
       </w:pPr>
       <w:r>
-        <w:t>Un réseau d’environ 130 boutiques revendeurs réparties en France.</w:t>
-      </w:r>
-    </w:p>
-    <w:p>
-      <w:pPr>
-        <w:pStyle w:val="ListBullet"/>
-        <w:spacing w:after="40"/>
-      </w:pPr>
-      <w:r>
-        <w:t>L’activité combine donc vente directe aux particuliers (B2C) et relations avec des revendeurs professionnels (B2B).</w:t>
+        <w:t>1083 combine ainsi un circuit direct vers le consommateur et un circuit de distribution passant par des revendeurs professionnels.</w:t>
       </w:r>
     </w:p>
     <w:p>
@@ -423,10 +433,7 @@
           </w:tcPr>
           <w:p>
             <w:r>
-              <w:rPr>
-                <w:sz w:val="18"/>
-              </w:rPr>
-              <w:t>Boutiques officielles</w:t>
+              <w:t>Points de vente directs</w:t>
             </w:r>
           </w:p>
         </w:tc>
@@ -443,10 +450,7 @@
           </w:tcPr>
           <w:p>
             <w:r>
-              <w:rPr>
-                <w:sz w:val="18"/>
-              </w:rPr>
-              <w:t>Romans-sur-Isère, Lyon, Grenoble, Nantes, Paris.</w:t>
+              <w:t>Boutiques officielles à Paris, Lyon (Croix-Rousse), Nantes et Grenoble ; magasin d’usine à Romans-sur-Isère.</w:t>
             </w:r>
           </w:p>
         </w:tc>
@@ -567,409 +571,7 @@
         <w:pStyle w:val="Heading1"/>
       </w:pPr>
       <w:r>
-        <w:t>5. Principales parties prenantes à retenir</w:t>
-      </w:r>
-    </w:p>
-    <w:p>
-      <w:r>
-        <w:t xml:space="preserve">Pour votre présentation, retenez </w:t>
-      </w:r>
-      <w:r>
-        <w:rPr>
-          <w:b/>
-        </w:rPr>
-        <w:t>6 à 8 parties prenantes principales maximum</w:t>
-      </w:r>
-      <w:r>
-        <w:t xml:space="preserve"> : celles dont la relation avec l’entreprise est importante pour son activité, ses ressources, ses ventes ou ses obligations.</w:t>
-      </w:r>
-    </w:p>
-    <w:tbl>
-      <w:tblPr>
-        <w:tblStyle w:val="TableGrid"/>
-        <w:tblW w:type="auto" w:w="0"/>
-        <w:jc w:val="center"/>
-        <w:tblLayout w:type="fixed"/>
-        <w:tblLook w:firstColumn="1" w:firstRow="1" w:lastColumn="0" w:lastRow="0" w:noHBand="0" w:noVBand="1" w:val="04A0"/>
-      </w:tblPr>
-      <w:tblGrid>
-        <w:gridCol w:w="5213"/>
-        <w:gridCol w:w="5213"/>
-      </w:tblGrid>
-      <w:tr>
-        <w:trPr>
-          <w:tblHeader w:val="true"/>
-          <w:cantSplit/>
-        </w:trPr>
-        <w:tc>
-          <w:tcPr>
-            <w:tcW w:type="dxa" w:w="2835"/>
-            <w:shd w:fill="315D77"/>
-            <w:vAlign w:val="center"/>
-            <w:tcMar>
-              <w:top w:w="80" w:type="dxa"/>
-              <w:start w:w="90" w:type="dxa"/>
-              <w:bottom w:w="80" w:type="dxa"/>
-              <w:end w:w="90" w:type="dxa"/>
-            </w:tcMar>
-          </w:tcPr>
-          <w:p>
-            <w:r>
-              <w:rPr>
-                <w:b/>
-                <w:color w:val="FFFFFF"/>
-                <w:sz w:val="18"/>
-              </w:rPr>
-              <w:t>Partie prenante</w:t>
-            </w:r>
-          </w:p>
-        </w:tc>
-        <w:tc>
-          <w:tcPr>
-            <w:tcW w:type="dxa" w:w="6463"/>
-            <w:shd w:fill="315D77"/>
-            <w:vAlign w:val="center"/>
-            <w:tcMar>
-              <w:top w:w="80" w:type="dxa"/>
-              <w:start w:w="90" w:type="dxa"/>
-              <w:bottom w:w="80" w:type="dxa"/>
-              <w:end w:w="90" w:type="dxa"/>
-            </w:tcMar>
-          </w:tcPr>
-          <w:p>
-            <w:r>
-              <w:rPr>
-                <w:b/>
-                <w:color w:val="FFFFFF"/>
-                <w:sz w:val="18"/>
-              </w:rPr>
-              <w:t>Relation avec l’entreprise</w:t>
-            </w:r>
-          </w:p>
-        </w:tc>
-      </w:tr>
-      <w:tr>
-        <w:trPr>
-          <w:cantSplit/>
-        </w:trPr>
-        <w:tc>
-          <w:tcPr>
-            <w:tcW w:type="dxa" w:w="2835"/>
-            <w:tcMar>
-              <w:top w:w="75" w:type="dxa"/>
-              <w:start w:w="85" w:type="dxa"/>
-              <w:bottom w:w="75" w:type="dxa"/>
-              <w:end w:w="85" w:type="dxa"/>
-            </w:tcMar>
-            <w:vAlign w:val="top"/>
-          </w:tcPr>
-          <w:p>
-            <w:r>
-              <w:rPr>
-                <w:sz w:val="18"/>
-              </w:rPr>
-              <w:t>Clients particuliers</w:t>
-            </w:r>
-          </w:p>
-        </w:tc>
-        <w:tc>
-          <w:tcPr>
-            <w:tcW w:type="dxa" w:w="6463"/>
-            <w:tcMar>
-              <w:top w:w="75" w:type="dxa"/>
-              <w:start w:w="85" w:type="dxa"/>
-              <w:bottom w:w="75" w:type="dxa"/>
-              <w:end w:w="85" w:type="dxa"/>
-            </w:tcMar>
-            <w:vAlign w:val="top"/>
-          </w:tcPr>
-          <w:p>
-            <w:r>
-              <w:rPr>
-                <w:sz w:val="18"/>
-              </w:rPr>
-              <w:t>Achètent en ligne ou en boutique ; utilisent le SAV.</w:t>
-            </w:r>
-          </w:p>
-        </w:tc>
-      </w:tr>
-      <w:tr>
-        <w:trPr>
-          <w:cantSplit/>
-        </w:trPr>
-        <w:tc>
-          <w:tcPr>
-            <w:tcW w:type="dxa" w:w="2835"/>
-            <w:tcMar>
-              <w:top w:w="75" w:type="dxa"/>
-              <w:start w:w="85" w:type="dxa"/>
-              <w:bottom w:w="75" w:type="dxa"/>
-              <w:end w:w="85" w:type="dxa"/>
-            </w:tcMar>
-            <w:vAlign w:val="top"/>
-          </w:tcPr>
-          <w:p>
-            <w:r>
-              <w:rPr>
-                <w:sz w:val="18"/>
-              </w:rPr>
-              <w:t>Revendeurs professionnels</w:t>
-            </w:r>
-          </w:p>
-        </w:tc>
-        <w:tc>
-          <w:tcPr>
-            <w:tcW w:type="dxa" w:w="6463"/>
-            <w:tcMar>
-              <w:top w:w="75" w:type="dxa"/>
-              <w:start w:w="85" w:type="dxa"/>
-              <w:bottom w:w="75" w:type="dxa"/>
-              <w:end w:w="85" w:type="dxa"/>
-            </w:tcMar>
-            <w:vAlign w:val="top"/>
-          </w:tcPr>
-          <w:p>
-            <w:r>
-              <w:rPr>
-                <w:sz w:val="18"/>
-              </w:rPr>
-              <w:t>Distribuent une sélection de produits 1083 et règlent leurs achats.</w:t>
-            </w:r>
-          </w:p>
-        </w:tc>
-      </w:tr>
-      <w:tr>
-        <w:trPr>
-          <w:cantSplit/>
-        </w:trPr>
-        <w:tc>
-          <w:tcPr>
-            <w:tcW w:type="dxa" w:w="2835"/>
-            <w:tcMar>
-              <w:top w:w="75" w:type="dxa"/>
-              <w:start w:w="85" w:type="dxa"/>
-              <w:bottom w:w="75" w:type="dxa"/>
-              <w:end w:w="85" w:type="dxa"/>
-            </w:tcMar>
-            <w:vAlign w:val="top"/>
-          </w:tcPr>
-          <w:p>
-            <w:r>
-              <w:rPr>
-                <w:sz w:val="18"/>
-              </w:rPr>
-              <w:t>Salariés</w:t>
-            </w:r>
-          </w:p>
-        </w:tc>
-        <w:tc>
-          <w:tcPr>
-            <w:tcW w:type="dxa" w:w="6463"/>
-            <w:tcMar>
-              <w:top w:w="75" w:type="dxa"/>
-              <w:start w:w="85" w:type="dxa"/>
-              <w:bottom w:w="75" w:type="dxa"/>
-              <w:end w:w="85" w:type="dxa"/>
-            </w:tcMar>
-            <w:vAlign w:val="top"/>
-          </w:tcPr>
-          <w:p>
-            <w:r>
-              <w:rPr>
-                <w:sz w:val="18"/>
-              </w:rPr>
-              <w:t>Participent à la conception, production, gestion, vente et fonctions de soutien.</w:t>
-            </w:r>
-          </w:p>
-        </w:tc>
-      </w:tr>
-      <w:tr>
-        <w:trPr>
-          <w:cantSplit/>
-        </w:trPr>
-        <w:tc>
-          <w:tcPr>
-            <w:tcW w:type="dxa" w:w="2835"/>
-            <w:tcMar>
-              <w:top w:w="75" w:type="dxa"/>
-              <w:start w:w="85" w:type="dxa"/>
-              <w:bottom w:w="75" w:type="dxa"/>
-              <w:end w:w="85" w:type="dxa"/>
-            </w:tcMar>
-            <w:vAlign w:val="top"/>
-          </w:tcPr>
-          <w:p>
-            <w:r>
-              <w:rPr>
-                <w:sz w:val="18"/>
-              </w:rPr>
-              <w:t>Ateliers et fournisseurs</w:t>
-            </w:r>
-          </w:p>
-        </w:tc>
-        <w:tc>
-          <w:tcPr>
-            <w:tcW w:type="dxa" w:w="6463"/>
-            <w:tcMar>
-              <w:top w:w="75" w:type="dxa"/>
-              <w:start w:w="85" w:type="dxa"/>
-              <w:bottom w:w="75" w:type="dxa"/>
-              <w:end w:w="85" w:type="dxa"/>
-            </w:tcMar>
-            <w:vAlign w:val="top"/>
-          </w:tcPr>
-          <w:p>
-            <w:r>
-              <w:rPr>
-                <w:sz w:val="18"/>
-              </w:rPr>
-              <w:t>Apportent matières, composants, opérations de fabrication et savoir-faire.</w:t>
-            </w:r>
-          </w:p>
-        </w:tc>
-      </w:tr>
-      <w:tr>
-        <w:trPr>
-          <w:cantSplit/>
-        </w:trPr>
-        <w:tc>
-          <w:tcPr>
-            <w:tcW w:type="dxa" w:w="2835"/>
-            <w:tcMar>
-              <w:top w:w="75" w:type="dxa"/>
-              <w:start w:w="85" w:type="dxa"/>
-              <w:bottom w:w="75" w:type="dxa"/>
-              <w:end w:w="85" w:type="dxa"/>
-            </w:tcMar>
-            <w:vAlign w:val="top"/>
-          </w:tcPr>
-          <w:p>
-            <w:r>
-              <w:rPr>
-                <w:sz w:val="18"/>
-              </w:rPr>
-              <w:t>Prestataires numériques</w:t>
-            </w:r>
-          </w:p>
-        </w:tc>
-        <w:tc>
-          <w:tcPr>
-            <w:tcW w:type="dxa" w:w="6463"/>
-            <w:tcMar>
-              <w:top w:w="75" w:type="dxa"/>
-              <w:start w:w="85" w:type="dxa"/>
-              <w:bottom w:w="75" w:type="dxa"/>
-              <w:end w:w="85" w:type="dxa"/>
-            </w:tcMar>
-            <w:vAlign w:val="top"/>
-          </w:tcPr>
-          <w:p>
-            <w:r>
-              <w:rPr>
-                <w:sz w:val="18"/>
-              </w:rPr>
-              <w:t>Hébergement et services techniques : le site est développé en interne sur Magento 2 et hébergé en France par un prestataire.</w:t>
-            </w:r>
-          </w:p>
-        </w:tc>
-      </w:tr>
-      <w:tr>
-        <w:trPr>
-          <w:cantSplit/>
-        </w:trPr>
-        <w:tc>
-          <w:tcPr>
-            <w:tcW w:type="dxa" w:w="2835"/>
-            <w:tcMar>
-              <w:top w:w="75" w:type="dxa"/>
-              <w:start w:w="85" w:type="dxa"/>
-              <w:bottom w:w="75" w:type="dxa"/>
-              <w:end w:w="85" w:type="dxa"/>
-            </w:tcMar>
-            <w:vAlign w:val="top"/>
-          </w:tcPr>
-          <w:p>
-            <w:r>
-              <w:rPr>
-                <w:sz w:val="18"/>
-              </w:rPr>
-              <w:t>Organismes publics / autorités</w:t>
-            </w:r>
-          </w:p>
-        </w:tc>
-        <w:tc>
-          <w:tcPr>
-            <w:tcW w:type="dxa" w:w="6463"/>
-            <w:tcMar>
-              <w:top w:w="75" w:type="dxa"/>
-              <w:start w:w="85" w:type="dxa"/>
-              <w:bottom w:w="75" w:type="dxa"/>
-              <w:end w:w="85" w:type="dxa"/>
-            </w:tcMar>
-            <w:vAlign w:val="top"/>
-          </w:tcPr>
-          <w:p>
-            <w:r>
-              <w:rPr>
-                <w:sz w:val="18"/>
-              </w:rPr>
-              <w:t>Fixent ou contrôlent certaines obligations applicables à l’entreprise.</w:t>
-            </w:r>
-          </w:p>
-        </w:tc>
-      </w:tr>
-      <w:tr>
-        <w:trPr>
-          <w:cantSplit/>
-        </w:trPr>
-        <w:tc>
-          <w:tcPr>
-            <w:tcW w:type="dxa" w:w="2835"/>
-            <w:tcMar>
-              <w:top w:w="75" w:type="dxa"/>
-              <w:start w:w="85" w:type="dxa"/>
-              <w:bottom w:w="75" w:type="dxa"/>
-              <w:end w:w="85" w:type="dxa"/>
-            </w:tcMar>
-            <w:vAlign w:val="top"/>
-          </w:tcPr>
-          <w:p>
-            <w:r>
-              <w:rPr>
-                <w:sz w:val="18"/>
-              </w:rPr>
-              <w:t>Organismes de certification</w:t>
-            </w:r>
-          </w:p>
-        </w:tc>
-        <w:tc>
-          <w:tcPr>
-            <w:tcW w:type="dxa" w:w="6463"/>
-            <w:tcMar>
-              <w:top w:w="75" w:type="dxa"/>
-              <w:start w:w="85" w:type="dxa"/>
-              <w:bottom w:w="75" w:type="dxa"/>
-              <w:end w:w="85" w:type="dxa"/>
-            </w:tcMar>
-            <w:vAlign w:val="top"/>
-          </w:tcPr>
-          <w:p>
-            <w:r>
-              <w:rPr>
-                <w:sz w:val="18"/>
-              </w:rPr>
-              <w:t>Définissent et contrôlent les critères des certifications choisies, dont Origine France Garantie.</w:t>
-            </w:r>
-          </w:p>
-        </w:tc>
-      </w:tr>
-    </w:tbl>
-    <w:p>
-      <w:pPr>
-        <w:pStyle w:val="Heading1"/>
-      </w:pPr>
-      <w:r>
-        <w:t>6. Ce que R01 ne permet pas de conclure</w:t>
+        <w:t>5. Ce que R01 ne permet pas de conclure</w:t>
       </w:r>
     </w:p>
     <w:p>
@@ -1004,7 +606,13 @@
         <w:pStyle w:val="Heading1"/>
       </w:pPr>
       <w:r>
-        <w:t>7. Sources publiques vérifiées le 8 septembre 2026</w:t>
+        <w:t>6. Sources publiques vérifiées le 19 septembre 2026</w:t>
+      </w:r>
+    </w:p>
+    <w:p>
+      <w:pPr/>
+      <w:r>
+        <w:t>Annuaire des entreprises : https://annuaire-entreprises.data.gouv.fr/entreprise/l-equipe-1083-498845064</w:t>
       </w:r>
     </w:p>
     <w:p>

</xml_diff>